<commit_message>
Corregir tildes y ortografia en el laboratorio, la PPT y los textos de aula.
Co-authored-by: Cursor <cursoragent@cursor.com>
</commit_message>
<xml_diff>
--- a/Cuentas-gratis.docx
+++ b/Cuentas-gratis.docx
@@ -13,7 +13,7 @@
           <w:sz w:val="44"/>
           <w:szCs w:val="44"/>
         </w:rPr>
-        <w:t xml:space="preserve">Cuentas gratuitas: hasta donde llegan</w:t>
+        <w:t xml:space="preserve">Cuentas gratuitas: hasta dónde llegan</w:t>
       </w:r>
     </w:p>
     <w:p>
@@ -47,7 +47,7 @@
         <w:spacing w:after="120"/>
       </w:pPr>
       <w:r>
-        <w:t xml:space="preserve">Chats de texto en el modelo gratuito que aparezca ese dia en ChatGPT Free. Archivos e imagenes tienen tope. No es un plan empresarial. Si la pantalla dice otra cosa, gana lo que ves.</w:t>
+        <w:t xml:space="preserve">Chats de texto en el modelo gratuito que aparezca ese día en ChatGPT Free. Archivos e imágenes tienen tope. No es un plan empresarial. Si la pantalla dice otra cosa, gana lo que ves.</w:t>
       </w:r>
     </w:p>
     <w:p>
@@ -69,7 +69,7 @@
         <w:spacing w:after="120"/>
       </w:pPr>
       <w:r>
-        <w:t xml:space="preserve">Cupo de creditos que se renueva cada 5 horas aproximadamente. Textos largos gastan mas. Usa Claude para comparar entregables, no para 80 iteraciones seguidas.</w:t>
+        <w:t xml:space="preserve">Cupo de créditos que se renueva cada 5 horas aproximadamente. Textos largos gastan más. Usa Claude para comparar entregables, no para 80 iteraciones seguidas.</w:t>
       </w:r>
     </w:p>
     <w:p>
@@ -95,7 +95,7 @@
         <w:spacing w:after="60"/>
       </w:pPr>
       <w:r>
-        <w:t xml:space="preserve">Pega texto anonimo, no archivos pesados.</w:t>
+        <w:t xml:space="preserve">Pega texto anónimo, no archivos pesados.</w:t>
       </w:r>
     </w:p>
     <w:p>

</xml_diff>